<commit_message>
Regenerate DOCX with Package 3 consistency fix
</commit_message>
<xml_diff>
--- a/report_3/Integrated_Report_3.docx
+++ b/report_3/Integrated_Report_3.docx
@@ -21129,7 +21129,7 @@
         <w:t>Package 3: `03_Load_DataMart.dtsx`</w:t>
       </w:r>
       <w:r>
-        <w:t xml:space="preserve"> — Creates and populates all dimension and fact tables in the data mart. Dimensions are loaded first (DimCategory → DimPromotion → DimTime → DimStore → DimProduct), then the fact table (FactWeeklySales). Uses both Execute SQL Tasks (for hardcoded inserts and complex JOINs) and Data Flow Tasks (for staging-to-DW transfers). Completes with DROP TABLE for temporary tables.</w:t>
+        <w:t xml:space="preserve"> — Creates and populates all dimension and fact tables in the data mart using Execute SQL Tasks. Dimensions are loaded first (DimCategory, DimPromotion, DimTime, DimStore, DimProduct), then the fact table (FactWeeklySales). Completes with DROP TABLE for temporary tables.</w:t>
       </w:r>
     </w:p>
     <w:p>
@@ -22273,7 +22273,7 @@
         <w:rPr>
           <w:b/>
         </w:rPr>
-        <w:t>Sample Data Flow Task (Store Dimension):</w:t>
+        <w:t>Sample Execute SQL Task (Dimension Loading):</w:t>
       </w:r>
       <w:r/>
     </w:p>
@@ -22286,7 +22286,7 @@
         <w:t>[</w:t>
       </w:r>
       <w:r>
-        <w:t>Screenshot 16: SSIS Package 3 — DimStore Data Flow</w:t>
+        <w:t>Screenshot 16: SSIS Package 3 -- Execute SQL Task for dimension loading</w:t>
       </w:r>
       <w:r>
         <w:rPr>
@@ -26603,7 +26603,7 @@
               <w:rPr>
                 <w:sz w:val="18"/>
               </w:rPr>
-              <w:t>SSIS Package 3 — DimStore Data Flow</w:t>
+              <w:t>SSIS Package 3 -- Execute SQL Task for dimension loading</w:t>
             </w:r>
           </w:p>
         </w:tc>

</xml_diff>